<commit_message>
upd DB in АСУЭП 6,7,8,12
</commit_message>
<xml_diff>
--- a/6_semester/Автоматизированные системы управления элементами промышленных и административных объектов/ПР7/ПР7_Павлов_НС.docx
+++ b/6_semester/Автоматизированные системы управления элементами промышленных и административных объектов/ПР7/ПР7_Павлов_НС.docx
@@ -7,6 +7,7 @@
         <w:jc w:val="both"/>
         <w:rPr>
           <w:rFonts w:cs="Times New Roman"/>
+          <w:lang w:val="en-US"/>
         </w:rPr>
       </w:pPr>
     </w:p>
@@ -1109,7 +1110,7 @@
           <w:r>
             <w:fldChar w:fldCharType="separate"/>
           </w:r>
-          <w:hyperlink w:anchor="_Toc228459475" w:history="1">
+          <w:hyperlink w:anchor="_Toc229325560" w:history="1">
             <w:r>
               <w:rPr>
                 <w:rStyle w:val="a8"/>
@@ -1155,7 +1156,7 @@
                 <w:noProof/>
                 <w:webHidden/>
               </w:rPr>
-              <w:instrText xml:space="preserve"> PAGEREF _Toc228459475 \h </w:instrText>
+              <w:instrText xml:space="preserve"> PAGEREF _Toc229325560 \h </w:instrText>
             </w:r>
             <w:r>
               <w:rPr>
@@ -1203,7 +1204,7 @@
               <w14:ligatures w14:val="standardContextual"/>
             </w:rPr>
           </w:pPr>
-          <w:hyperlink w:anchor="_Toc228459476" w:history="1">
+          <w:hyperlink w:anchor="_Toc229325561" w:history="1">
             <w:r>
               <w:rPr>
                 <w:rStyle w:val="a8"/>
@@ -1249,7 +1250,7 @@
                 <w:noProof/>
                 <w:webHidden/>
               </w:rPr>
-              <w:instrText xml:space="preserve"> PAGEREF _Toc228459476 \h </w:instrText>
+              <w:instrText xml:space="preserve"> PAGEREF _Toc229325561 \h </w:instrText>
             </w:r>
             <w:r>
               <w:rPr>
@@ -1297,7 +1298,7 @@
               <w14:ligatures w14:val="standardContextual"/>
             </w:rPr>
           </w:pPr>
-          <w:hyperlink w:anchor="_Toc228459477" w:history="1">
+          <w:hyperlink w:anchor="_Toc229325562" w:history="1">
             <w:r>
               <w:rPr>
                 <w:rStyle w:val="a8"/>
@@ -1343,7 +1344,7 @@
                 <w:noProof/>
                 <w:webHidden/>
               </w:rPr>
-              <w:instrText xml:space="preserve"> PAGEREF _Toc228459477 \h </w:instrText>
+              <w:instrText xml:space="preserve"> PAGEREF _Toc229325562 \h </w:instrText>
             </w:r>
             <w:r>
               <w:rPr>
@@ -1391,7 +1392,7 @@
               <w14:ligatures w14:val="standardContextual"/>
             </w:rPr>
           </w:pPr>
-          <w:hyperlink w:anchor="_Toc228459478" w:history="1">
+          <w:hyperlink w:anchor="_Toc229325563" w:history="1">
             <w:r>
               <w:rPr>
                 <w:rStyle w:val="a8"/>
@@ -1437,7 +1438,7 @@
                 <w:noProof/>
                 <w:webHidden/>
               </w:rPr>
-              <w:instrText xml:space="preserve"> PAGEREF _Toc228459478 \h </w:instrText>
+              <w:instrText xml:space="preserve"> PAGEREF _Toc229325563 \h </w:instrText>
             </w:r>
             <w:r>
               <w:rPr>
@@ -1485,7 +1486,7 @@
               <w14:ligatures w14:val="standardContextual"/>
             </w:rPr>
           </w:pPr>
-          <w:hyperlink w:anchor="_Toc228459479" w:history="1">
+          <w:hyperlink w:anchor="_Toc229325564" w:history="1">
             <w:r>
               <w:rPr>
                 <w:rStyle w:val="a8"/>
@@ -1531,7 +1532,7 @@
                 <w:noProof/>
                 <w:webHidden/>
               </w:rPr>
-              <w:instrText xml:space="preserve"> PAGEREF _Toc228459479 \h </w:instrText>
+              <w:instrText xml:space="preserve"> PAGEREF _Toc229325564 \h </w:instrText>
             </w:r>
             <w:r>
               <w:rPr>
@@ -1579,7 +1580,7 @@
               <w14:ligatures w14:val="standardContextual"/>
             </w:rPr>
           </w:pPr>
-          <w:hyperlink w:anchor="_Toc228459480" w:history="1">
+          <w:hyperlink w:anchor="_Toc229325565" w:history="1">
             <w:r>
               <w:rPr>
                 <w:rStyle w:val="a8"/>
@@ -1625,7 +1626,7 @@
                 <w:noProof/>
                 <w:webHidden/>
               </w:rPr>
-              <w:instrText xml:space="preserve"> PAGEREF _Toc228459480 \h </w:instrText>
+              <w:instrText xml:space="preserve"> PAGEREF _Toc229325565 \h </w:instrText>
             </w:r>
             <w:r>
               <w:rPr>
@@ -1673,7 +1674,7 @@
               <w14:ligatures w14:val="standardContextual"/>
             </w:rPr>
           </w:pPr>
-          <w:hyperlink w:anchor="_Toc228459481" w:history="1">
+          <w:hyperlink w:anchor="_Toc229325566" w:history="1">
             <w:r>
               <w:rPr>
                 <w:rStyle w:val="a8"/>
@@ -1719,7 +1720,7 @@
                 <w:noProof/>
                 <w:webHidden/>
               </w:rPr>
-              <w:instrText xml:space="preserve"> PAGEREF _Toc228459481 \h </w:instrText>
+              <w:instrText xml:space="preserve"> PAGEREF _Toc229325566 \h </w:instrText>
             </w:r>
             <w:r>
               <w:rPr>
@@ -1767,7 +1768,7 @@
               <w14:ligatures w14:val="standardContextual"/>
             </w:rPr>
           </w:pPr>
-          <w:hyperlink w:anchor="_Toc228459482" w:history="1">
+          <w:hyperlink w:anchor="_Toc229325567" w:history="1">
             <w:r>
               <w:rPr>
                 <w:rStyle w:val="a8"/>
@@ -1813,7 +1814,7 @@
                 <w:noProof/>
                 <w:webHidden/>
               </w:rPr>
-              <w:instrText xml:space="preserve"> PAGEREF _Toc228459482 \h </w:instrText>
+              <w:instrText xml:space="preserve"> PAGEREF _Toc229325567 \h </w:instrText>
             </w:r>
             <w:r>
               <w:rPr>
@@ -1861,7 +1862,7 @@
               <w14:ligatures w14:val="standardContextual"/>
             </w:rPr>
           </w:pPr>
-          <w:hyperlink w:anchor="_Toc228459483" w:history="1">
+          <w:hyperlink w:anchor="_Toc229325568" w:history="1">
             <w:r>
               <w:rPr>
                 <w:rStyle w:val="a8"/>
@@ -1907,7 +1908,7 @@
                 <w:noProof/>
                 <w:webHidden/>
               </w:rPr>
-              <w:instrText xml:space="preserve"> PAGEREF _Toc228459483 \h </w:instrText>
+              <w:instrText xml:space="preserve"> PAGEREF _Toc229325568 \h </w:instrText>
             </w:r>
             <w:r>
               <w:rPr>
@@ -1955,7 +1956,7 @@
               <w14:ligatures w14:val="standardContextual"/>
             </w:rPr>
           </w:pPr>
-          <w:hyperlink w:anchor="_Toc228459484" w:history="1">
+          <w:hyperlink w:anchor="_Toc229325569" w:history="1">
             <w:r>
               <w:rPr>
                 <w:rStyle w:val="a8"/>
@@ -2001,7 +2002,7 @@
                 <w:noProof/>
                 <w:webHidden/>
               </w:rPr>
-              <w:instrText xml:space="preserve"> PAGEREF _Toc228459484 \h </w:instrText>
+              <w:instrText xml:space="preserve"> PAGEREF _Toc229325569 \h </w:instrText>
             </w:r>
             <w:r>
               <w:rPr>
@@ -2049,7 +2050,7 @@
               <w14:ligatures w14:val="standardContextual"/>
             </w:rPr>
           </w:pPr>
-          <w:hyperlink w:anchor="_Toc228459485" w:history="1">
+          <w:hyperlink w:anchor="_Toc229325570" w:history="1">
             <w:r>
               <w:rPr>
                 <w:rStyle w:val="a8"/>
@@ -2095,7 +2096,7 @@
                 <w:noProof/>
                 <w:webHidden/>
               </w:rPr>
-              <w:instrText xml:space="preserve"> PAGEREF _Toc228459485 \h </w:instrText>
+              <w:instrText xml:space="preserve"> PAGEREF _Toc229325570 \h </w:instrText>
             </w:r>
             <w:r>
               <w:rPr>
@@ -2143,7 +2144,7 @@
               <w14:ligatures w14:val="standardContextual"/>
             </w:rPr>
           </w:pPr>
-          <w:hyperlink w:anchor="_Toc228459486" w:history="1">
+          <w:hyperlink w:anchor="_Toc229325571" w:history="1">
             <w:r>
               <w:rPr>
                 <w:rStyle w:val="a8"/>
@@ -2189,7 +2190,7 @@
                 <w:noProof/>
                 <w:webHidden/>
               </w:rPr>
-              <w:instrText xml:space="preserve"> PAGEREF _Toc228459486 \h </w:instrText>
+              <w:instrText xml:space="preserve"> PAGEREF _Toc229325571 \h </w:instrText>
             </w:r>
             <w:r>
               <w:rPr>
@@ -2237,7 +2238,7 @@
               <w14:ligatures w14:val="standardContextual"/>
             </w:rPr>
           </w:pPr>
-          <w:hyperlink w:anchor="_Toc228459487" w:history="1">
+          <w:hyperlink w:anchor="_Toc229325572" w:history="1">
             <w:r>
               <w:rPr>
                 <w:rStyle w:val="a8"/>
@@ -2283,7 +2284,7 @@
                 <w:noProof/>
                 <w:webHidden/>
               </w:rPr>
-              <w:instrText xml:space="preserve"> PAGEREF _Toc228459487 \h </w:instrText>
+              <w:instrText xml:space="preserve"> PAGEREF _Toc229325572 \h </w:instrText>
             </w:r>
             <w:r>
               <w:rPr>
@@ -2331,7 +2332,7 @@
               <w14:ligatures w14:val="standardContextual"/>
             </w:rPr>
           </w:pPr>
-          <w:hyperlink w:anchor="_Toc228459488" w:history="1">
+          <w:hyperlink w:anchor="_Toc229325573" w:history="1">
             <w:r>
               <w:rPr>
                 <w:rStyle w:val="a8"/>
@@ -2377,7 +2378,7 @@
                 <w:noProof/>
                 <w:webHidden/>
               </w:rPr>
-              <w:instrText xml:space="preserve"> PAGEREF _Toc228459488 \h </w:instrText>
+              <w:instrText xml:space="preserve"> PAGEREF _Toc229325573 \h </w:instrText>
             </w:r>
             <w:r>
               <w:rPr>
@@ -2425,7 +2426,7 @@
               <w14:ligatures w14:val="standardContextual"/>
             </w:rPr>
           </w:pPr>
-          <w:hyperlink w:anchor="_Toc228459489" w:history="1">
+          <w:hyperlink w:anchor="_Toc229325574" w:history="1">
             <w:r>
               <w:rPr>
                 <w:rStyle w:val="a8"/>
@@ -2471,7 +2472,7 @@
                 <w:noProof/>
                 <w:webHidden/>
               </w:rPr>
-              <w:instrText xml:space="preserve"> PAGEREF _Toc228459489 \h </w:instrText>
+              <w:instrText xml:space="preserve"> PAGEREF _Toc229325574 \h </w:instrText>
             </w:r>
             <w:r>
               <w:rPr>
@@ -2519,7 +2520,7 @@
               <w14:ligatures w14:val="standardContextual"/>
             </w:rPr>
           </w:pPr>
-          <w:hyperlink w:anchor="_Toc228459490" w:history="1">
+          <w:hyperlink w:anchor="_Toc229325575" w:history="1">
             <w:r>
               <w:rPr>
                 <w:rStyle w:val="a8"/>
@@ -2565,7 +2566,7 @@
                 <w:noProof/>
                 <w:webHidden/>
               </w:rPr>
-              <w:instrText xml:space="preserve"> PAGEREF _Toc228459490 \h </w:instrText>
+              <w:instrText xml:space="preserve"> PAGEREF _Toc229325575 \h </w:instrText>
             </w:r>
             <w:r>
               <w:rPr>
@@ -2613,7 +2614,7 @@
               <w14:ligatures w14:val="standardContextual"/>
             </w:rPr>
           </w:pPr>
-          <w:hyperlink w:anchor="_Toc228459491" w:history="1">
+          <w:hyperlink w:anchor="_Toc229325576" w:history="1">
             <w:r>
               <w:rPr>
                 <w:rStyle w:val="a8"/>
@@ -2659,7 +2660,7 @@
                 <w:noProof/>
                 <w:webHidden/>
               </w:rPr>
-              <w:instrText xml:space="preserve"> PAGEREF _Toc228459491 \h </w:instrText>
+              <w:instrText xml:space="preserve"> PAGEREF _Toc229325576 \h </w:instrText>
             </w:r>
             <w:r>
               <w:rPr>
@@ -2706,7 +2707,7 @@
               <w14:ligatures w14:val="standardContextual"/>
             </w:rPr>
           </w:pPr>
-          <w:hyperlink w:anchor="_Toc228459492" w:history="1">
+          <w:hyperlink w:anchor="_Toc229325577" w:history="1">
             <w:r>
               <w:rPr>
                 <w:rStyle w:val="a8"/>
@@ -2752,7 +2753,7 @@
                 <w:noProof/>
                 <w:webHidden/>
               </w:rPr>
-              <w:instrText xml:space="preserve"> PAGEREF _Toc228459492 \h </w:instrText>
+              <w:instrText xml:space="preserve"> PAGEREF _Toc229325577 \h </w:instrText>
             </w:r>
             <w:r>
               <w:rPr>
@@ -2800,7 +2801,7 @@
               <w14:ligatures w14:val="standardContextual"/>
             </w:rPr>
           </w:pPr>
-          <w:hyperlink w:anchor="_Toc228459493" w:history="1">
+          <w:hyperlink w:anchor="_Toc229325578" w:history="1">
             <w:r>
               <w:rPr>
                 <w:rStyle w:val="a8"/>
@@ -2846,7 +2847,7 @@
                 <w:noProof/>
                 <w:webHidden/>
               </w:rPr>
-              <w:instrText xml:space="preserve"> PAGEREF _Toc228459493 \h </w:instrText>
+              <w:instrText xml:space="preserve"> PAGEREF _Toc229325578 \h </w:instrText>
             </w:r>
             <w:r>
               <w:rPr>
@@ -2893,7 +2894,7 @@
               <w14:ligatures w14:val="standardContextual"/>
             </w:rPr>
           </w:pPr>
-          <w:hyperlink w:anchor="_Toc228459494" w:history="1">
+          <w:hyperlink w:anchor="_Toc229325579" w:history="1">
             <w:r>
               <w:rPr>
                 <w:rStyle w:val="a8"/>
@@ -2938,7 +2939,7 @@
                 <w:noProof/>
                 <w:webHidden/>
               </w:rPr>
-              <w:instrText xml:space="preserve"> PAGEREF _Toc228459494 \h </w:instrText>
+              <w:instrText xml:space="preserve"> PAGEREF _Toc229325579 \h </w:instrText>
             </w:r>
             <w:r>
               <w:rPr>
@@ -2985,7 +2986,7 @@
               <w14:ligatures w14:val="standardContextual"/>
             </w:rPr>
           </w:pPr>
-          <w:hyperlink w:anchor="_Toc228459495" w:history="1">
+          <w:hyperlink w:anchor="_Toc229325580" w:history="1">
             <w:r>
               <w:rPr>
                 <w:rStyle w:val="a8"/>
@@ -3030,7 +3031,7 @@
                 <w:noProof/>
                 <w:webHidden/>
               </w:rPr>
-              <w:instrText xml:space="preserve"> PAGEREF _Toc228459495 \h </w:instrText>
+              <w:instrText xml:space="preserve"> PAGEREF _Toc229325580 \h </w:instrText>
             </w:r>
             <w:r>
               <w:rPr>
@@ -3077,7 +3078,7 @@
               <w14:ligatures w14:val="standardContextual"/>
             </w:rPr>
           </w:pPr>
-          <w:hyperlink w:anchor="_Toc228459496" w:history="1">
+          <w:hyperlink w:anchor="_Toc229325581" w:history="1">
             <w:r>
               <w:rPr>
                 <w:rStyle w:val="a8"/>
@@ -3122,7 +3123,7 @@
                 <w:noProof/>
                 <w:webHidden/>
               </w:rPr>
-              <w:instrText xml:space="preserve"> PAGEREF _Toc228459496 \h </w:instrText>
+              <w:instrText xml:space="preserve"> PAGEREF _Toc229325581 \h </w:instrText>
             </w:r>
             <w:r>
               <w:rPr>
@@ -3169,7 +3170,7 @@
               <w14:ligatures w14:val="standardContextual"/>
             </w:rPr>
           </w:pPr>
-          <w:hyperlink w:anchor="_Toc228459497" w:history="1">
+          <w:hyperlink w:anchor="_Toc229325582" w:history="1">
             <w:r>
               <w:rPr>
                 <w:rStyle w:val="a8"/>
@@ -3214,7 +3215,7 @@
                 <w:noProof/>
                 <w:webHidden/>
               </w:rPr>
-              <w:instrText xml:space="preserve"> PAGEREF _Toc228459497 \h </w:instrText>
+              <w:instrText xml:space="preserve"> PAGEREF _Toc229325582 \h </w:instrText>
             </w:r>
             <w:r>
               <w:rPr>
@@ -3261,7 +3262,7 @@
               <w14:ligatures w14:val="standardContextual"/>
             </w:rPr>
           </w:pPr>
-          <w:hyperlink w:anchor="_Toc228459498" w:history="1">
+          <w:hyperlink w:anchor="_Toc229325583" w:history="1">
             <w:r>
               <w:rPr>
                 <w:rStyle w:val="a8"/>
@@ -3306,7 +3307,7 @@
                 <w:noProof/>
                 <w:webHidden/>
               </w:rPr>
-              <w:instrText xml:space="preserve"> PAGEREF _Toc228459498 \h </w:instrText>
+              <w:instrText xml:space="preserve"> PAGEREF _Toc229325583 \h </w:instrText>
             </w:r>
             <w:r>
               <w:rPr>
@@ -3326,7 +3327,7 @@
                 <w:noProof/>
                 <w:webHidden/>
               </w:rPr>
-              <w:t>14</w:t>
+              <w:t>13</w:t>
             </w:r>
             <w:r>
               <w:rPr>
@@ -3354,7 +3355,7 @@
               <w14:ligatures w14:val="standardContextual"/>
             </w:rPr>
           </w:pPr>
-          <w:hyperlink w:anchor="_Toc228459499" w:history="1">
+          <w:hyperlink w:anchor="_Toc229325584" w:history="1">
             <w:r>
               <w:rPr>
                 <w:rStyle w:val="a8"/>
@@ -3400,7 +3401,7 @@
                 <w:noProof/>
                 <w:webHidden/>
               </w:rPr>
-              <w:instrText xml:space="preserve"> PAGEREF _Toc228459499 \h </w:instrText>
+              <w:instrText xml:space="preserve"> PAGEREF _Toc229325584 \h </w:instrText>
             </w:r>
             <w:r>
               <w:rPr>
@@ -3448,7 +3449,7 @@
               <w14:ligatures w14:val="standardContextual"/>
             </w:rPr>
           </w:pPr>
-          <w:hyperlink w:anchor="_Toc228459500" w:history="1">
+          <w:hyperlink w:anchor="_Toc229325585" w:history="1">
             <w:r>
               <w:rPr>
                 <w:rStyle w:val="a8"/>
@@ -3494,7 +3495,7 @@
                 <w:noProof/>
                 <w:webHidden/>
               </w:rPr>
-              <w:instrText xml:space="preserve"> PAGEREF _Toc228459500 \h </w:instrText>
+              <w:instrText xml:space="preserve"> PAGEREF _Toc229325585 \h </w:instrText>
             </w:r>
             <w:r>
               <w:rPr>
@@ -3542,7 +3543,7 @@
               <w14:ligatures w14:val="standardContextual"/>
             </w:rPr>
           </w:pPr>
-          <w:hyperlink w:anchor="_Toc228459501" w:history="1">
+          <w:hyperlink w:anchor="_Toc229325586" w:history="1">
             <w:r>
               <w:rPr>
                 <w:rStyle w:val="a8"/>
@@ -3588,7 +3589,7 @@
                 <w:noProof/>
                 <w:webHidden/>
               </w:rPr>
-              <w:instrText xml:space="preserve"> PAGEREF _Toc228459501 \h </w:instrText>
+              <w:instrText xml:space="preserve"> PAGEREF _Toc229325586 \h </w:instrText>
             </w:r>
             <w:r>
               <w:rPr>
@@ -3608,7 +3609,7 @@
                 <w:noProof/>
                 <w:webHidden/>
               </w:rPr>
-              <w:t>18</w:t>
+              <w:t>17</w:t>
             </w:r>
             <w:r>
               <w:rPr>
@@ -3645,7 +3646,7 @@
       <w:pPr>
         <w:pStyle w:val="1"/>
       </w:pPr>
-      <w:bookmarkStart w:id="1" w:name="_Toc228459475"/>
+      <w:bookmarkStart w:id="1" w:name="_Toc229325560"/>
       <w:r>
         <w:lastRenderedPageBreak/>
         <w:t>Выделение и описание полей (свойств) и методов выбранных классов</w:t>
@@ -3656,7 +3657,7 @@
       <w:pPr>
         <w:pStyle w:val="20"/>
       </w:pPr>
-      <w:bookmarkStart w:id="2" w:name="_Toc228459476"/>
+      <w:bookmarkStart w:id="2" w:name="_Toc229325561"/>
       <w:r>
         <w:t>Класс «Пользователь» (абстрактный)</w:t>
       </w:r>
@@ -4417,7 +4418,7 @@
       <w:pPr>
         <w:pStyle w:val="20"/>
       </w:pPr>
-      <w:bookmarkStart w:id="3" w:name="_Toc228459477"/>
+      <w:bookmarkStart w:id="3" w:name="_Toc229325562"/>
       <w:r>
         <w:t>Класс «Спортсмен» (наследует Пользователь)</w:t>
       </w:r>
@@ -4867,7 +4868,7 @@
       <w:pPr>
         <w:pStyle w:val="20"/>
       </w:pPr>
-      <w:bookmarkStart w:id="4" w:name="_Toc228459478"/>
+      <w:bookmarkStart w:id="4" w:name="_Toc229325563"/>
       <w:r>
         <w:t xml:space="preserve">Класс </w:t>
       </w:r>
@@ -5249,7 +5250,7 @@
       <w:pPr>
         <w:pStyle w:val="20"/>
       </w:pPr>
-      <w:bookmarkStart w:id="5" w:name="_Toc228459479"/>
+      <w:bookmarkStart w:id="5" w:name="_Toc229325564"/>
       <w:r>
         <w:t xml:space="preserve">Класс </w:t>
       </w:r>
@@ -5554,7 +5555,7 @@
       <w:pPr>
         <w:pStyle w:val="20"/>
       </w:pPr>
-      <w:bookmarkStart w:id="6" w:name="_Toc228459480"/>
+      <w:bookmarkStart w:id="6" w:name="_Toc229325565"/>
       <w:r>
         <w:lastRenderedPageBreak/>
         <w:t xml:space="preserve">Класс </w:t>
@@ -5783,7 +5784,7 @@
       <w:pPr>
         <w:pStyle w:val="20"/>
       </w:pPr>
-      <w:bookmarkStart w:id="7" w:name="_Toc228459481"/>
+      <w:bookmarkStart w:id="7" w:name="_Toc229325566"/>
       <w:r>
         <w:t xml:space="preserve">Класс </w:t>
       </w:r>
@@ -6088,7 +6089,7 @@
       <w:pPr>
         <w:pStyle w:val="20"/>
       </w:pPr>
-      <w:bookmarkStart w:id="8" w:name="_Toc228459482"/>
+      <w:bookmarkStart w:id="8" w:name="_Toc229325567"/>
       <w:r>
         <w:t xml:space="preserve">Класс </w:t>
       </w:r>
@@ -6316,7 +6317,7 @@
       <w:pPr>
         <w:pStyle w:val="20"/>
       </w:pPr>
-      <w:bookmarkStart w:id="9" w:name="_Toc228459483"/>
+      <w:bookmarkStart w:id="9" w:name="_Toc229325568"/>
       <w:r>
         <w:t xml:space="preserve">Класс </w:t>
       </w:r>
@@ -6544,7 +6545,7 @@
       <w:pPr>
         <w:pStyle w:val="20"/>
       </w:pPr>
-      <w:bookmarkStart w:id="10" w:name="_Toc228459484"/>
+      <w:bookmarkStart w:id="10" w:name="_Toc229325569"/>
       <w:r>
         <w:t>Класс «</w:t>
       </w:r>
@@ -7300,7 +7301,7 @@
       <w:pPr>
         <w:pStyle w:val="20"/>
       </w:pPr>
-      <w:bookmarkStart w:id="11" w:name="_Toc228459485"/>
+      <w:bookmarkStart w:id="11" w:name="_Toc229325570"/>
       <w:r>
         <w:t>Класс «</w:t>
       </w:r>
@@ -7868,7 +7869,7 @@
       <w:pPr>
         <w:pStyle w:val="20"/>
       </w:pPr>
-      <w:bookmarkStart w:id="12" w:name="_Toc228459486"/>
+      <w:bookmarkStart w:id="12" w:name="_Toc229325571"/>
       <w:r>
         <w:t>Класс «</w:t>
       </w:r>
@@ -8585,7 +8586,7 @@
       <w:pPr>
         <w:pStyle w:val="20"/>
       </w:pPr>
-      <w:bookmarkStart w:id="13" w:name="_Toc228459487"/>
+      <w:bookmarkStart w:id="13" w:name="_Toc229325572"/>
       <w:r>
         <w:t>Класс «</w:t>
       </w:r>
@@ -9376,7 +9377,7 @@
       <w:pPr>
         <w:pStyle w:val="20"/>
       </w:pPr>
-      <w:bookmarkStart w:id="14" w:name="_Toc228459488"/>
+      <w:bookmarkStart w:id="14" w:name="_Toc229325573"/>
       <w:r>
         <w:t>Класс «</w:t>
       </w:r>
@@ -10093,7 +10094,7 @@
       <w:pPr>
         <w:pStyle w:val="20"/>
       </w:pPr>
-      <w:bookmarkStart w:id="15" w:name="_Toc228459489"/>
+      <w:bookmarkStart w:id="15" w:name="_Toc229325574"/>
       <w:r>
         <w:lastRenderedPageBreak/>
         <w:t>Класс «</w:t>
@@ -11042,7 +11043,7 @@
       <w:pPr>
         <w:pStyle w:val="20"/>
       </w:pPr>
-      <w:bookmarkStart w:id="16" w:name="_Toc228459490"/>
+      <w:bookmarkStart w:id="16" w:name="_Toc229325575"/>
       <w:r>
         <w:t>Класс «</w:t>
       </w:r>
@@ -11899,7 +11900,7 @@
       <w:pPr>
         <w:pStyle w:val="20"/>
       </w:pPr>
-      <w:bookmarkStart w:id="17" w:name="_Toc228459491"/>
+      <w:bookmarkStart w:id="17" w:name="_Toc229325576"/>
       <w:r>
         <w:t>Класс «</w:t>
       </w:r>
@@ -12542,7 +12543,7 @@
       <w:pPr>
         <w:pStyle w:val="1"/>
       </w:pPr>
-      <w:bookmarkStart w:id="18" w:name="_Toc228459492"/>
+      <w:bookmarkStart w:id="18" w:name="_Toc229325577"/>
       <w:r>
         <w:lastRenderedPageBreak/>
         <w:t>Построение ER-диаграммы на основе классовой диаграммы</w:t>
@@ -12553,7 +12554,7 @@
       <w:pPr>
         <w:pStyle w:val="20"/>
       </w:pPr>
-      <w:bookmarkStart w:id="19" w:name="_Toc228459493"/>
+      <w:bookmarkStart w:id="19" w:name="_Toc229325578"/>
       <w:r>
         <w:t>Описание таблиц и полей</w:t>
       </w:r>
@@ -12749,7 +12750,7 @@
       <w:pPr>
         <w:pStyle w:val="3"/>
       </w:pPr>
-      <w:bookmarkStart w:id="20" w:name="_Toc228459494"/>
+      <w:bookmarkStart w:id="20" w:name="_Toc229325579"/>
       <w:r>
         <w:t>Таблицы группы «Пользователи и роли»</w:t>
       </w:r>
@@ -14105,10 +14106,10 @@
         <w:tblLook w:val="04A0" w:firstRow="1" w:lastRow="0" w:firstColumn="1" w:lastColumn="0" w:noHBand="0" w:noVBand="1"/>
       </w:tblPr>
       <w:tblGrid>
-        <w:gridCol w:w="1843"/>
+        <w:gridCol w:w="1763"/>
         <w:gridCol w:w="1790"/>
-        <w:gridCol w:w="3479"/>
-        <w:gridCol w:w="2232"/>
+        <w:gridCol w:w="3542"/>
+        <w:gridCol w:w="2249"/>
       </w:tblGrid>
       <w:tr>
         <w:trPr>
@@ -14374,31 +14375,8 @@
               <w:rPr>
                 <w:sz w:val="24"/>
                 <w:szCs w:val="22"/>
-                <w:lang w:val="en-US"/>
               </w:rPr>
               <w:lastRenderedPageBreak/>
-              <w:t>a</w:t>
-            </w:r>
-            <w:r>
-              <w:rPr>
-                <w:sz w:val="24"/>
-                <w:szCs w:val="22"/>
-              </w:rPr>
-              <w:t>thlete</w:t>
-            </w:r>
-            <w:r>
-              <w:rPr>
-                <w:sz w:val="24"/>
-                <w:szCs w:val="22"/>
-                <w:lang w:val="en-US"/>
-              </w:rPr>
-              <w:t>_</w:t>
-            </w:r>
-            <w:r>
-              <w:rPr>
-                <w:sz w:val="24"/>
-                <w:szCs w:val="22"/>
-              </w:rPr>
               <w:t>user_id</w:t>
             </w:r>
           </w:p>
@@ -14705,29 +14683,6 @@
               <w:rPr>
                 <w:sz w:val="24"/>
                 <w:szCs w:val="22"/>
-                <w:lang w:val="en-US"/>
-              </w:rPr>
-              <w:t>a</w:t>
-            </w:r>
-            <w:r>
-              <w:rPr>
-                <w:sz w:val="24"/>
-                <w:szCs w:val="22"/>
-              </w:rPr>
-              <w:t>thlete</w:t>
-            </w:r>
-            <w:r>
-              <w:rPr>
-                <w:sz w:val="24"/>
-                <w:szCs w:val="22"/>
-                <w:lang w:val="en-US"/>
-              </w:rPr>
-              <w:t>_</w:t>
-            </w:r>
-            <w:r>
-              <w:rPr>
-                <w:sz w:val="24"/>
-                <w:szCs w:val="22"/>
               </w:rPr>
               <w:t>group_id</w:t>
             </w:r>
@@ -14840,29 +14795,6 @@
                 <w:szCs w:val="22"/>
               </w:rPr>
             </w:pPr>
-            <w:r>
-              <w:rPr>
-                <w:sz w:val="24"/>
-                <w:szCs w:val="22"/>
-                <w:lang w:val="en-US"/>
-              </w:rPr>
-              <w:t>a</w:t>
-            </w:r>
-            <w:r>
-              <w:rPr>
-                <w:sz w:val="24"/>
-                <w:szCs w:val="22"/>
-              </w:rPr>
-              <w:t>thlete</w:t>
-            </w:r>
-            <w:r>
-              <w:rPr>
-                <w:sz w:val="24"/>
-                <w:szCs w:val="22"/>
-                <w:lang w:val="en-US"/>
-              </w:rPr>
-              <w:t>_</w:t>
-            </w:r>
             <w:r>
               <w:rPr>
                 <w:sz w:val="24"/>
@@ -15368,14 +15300,6 @@
               <w:rPr>
                 <w:sz w:val="24"/>
                 <w:szCs w:val="22"/>
-                <w:lang w:val="en-US"/>
-              </w:rPr>
-              <w:t>coach_</w:t>
-            </w:r>
-            <w:r>
-              <w:rPr>
-                <w:sz w:val="24"/>
-                <w:szCs w:val="22"/>
               </w:rPr>
               <w:t>user_id</w:t>
             </w:r>
@@ -15721,10 +15645,10 @@
         <w:tblLook w:val="04A0" w:firstRow="1" w:lastRow="0" w:firstColumn="1" w:lastColumn="0" w:noHBand="0" w:noVBand="1"/>
       </w:tblPr>
       <w:tblGrid>
-        <w:gridCol w:w="2775"/>
+        <w:gridCol w:w="2029"/>
         <w:gridCol w:w="1790"/>
-        <w:gridCol w:w="2929"/>
-        <w:gridCol w:w="1850"/>
+        <w:gridCol w:w="3492"/>
+        <w:gridCol w:w="2033"/>
       </w:tblGrid>
       <w:tr>
         <w:trPr>
@@ -15990,29 +15914,6 @@
               <w:rPr>
                 <w:sz w:val="24"/>
                 <w:szCs w:val="22"/>
-                <w:lang w:val="en-US"/>
-              </w:rPr>
-              <w:t>s</w:t>
-            </w:r>
-            <w:r>
-              <w:rPr>
-                <w:sz w:val="24"/>
-                <w:szCs w:val="22"/>
-              </w:rPr>
-              <w:t>torekeeper</w:t>
-            </w:r>
-            <w:r>
-              <w:rPr>
-                <w:sz w:val="24"/>
-                <w:szCs w:val="22"/>
-                <w:lang w:val="en-US"/>
-              </w:rPr>
-              <w:t>_</w:t>
-            </w:r>
-            <w:r>
-              <w:rPr>
-                <w:sz w:val="24"/>
-                <w:szCs w:val="22"/>
               </w:rPr>
               <w:t>user_id</w:t>
             </w:r>
@@ -16128,29 +16029,6 @@
                 <w:szCs w:val="22"/>
               </w:rPr>
             </w:pPr>
-            <w:r>
-              <w:rPr>
-                <w:sz w:val="24"/>
-                <w:szCs w:val="22"/>
-                <w:lang w:val="en-US"/>
-              </w:rPr>
-              <w:t>s</w:t>
-            </w:r>
-            <w:r>
-              <w:rPr>
-                <w:sz w:val="24"/>
-                <w:szCs w:val="22"/>
-              </w:rPr>
-              <w:t>torekeeper</w:t>
-            </w:r>
-            <w:r>
-              <w:rPr>
-                <w:sz w:val="24"/>
-                <w:szCs w:val="22"/>
-                <w:lang w:val="en-US"/>
-              </w:rPr>
-              <w:t>_</w:t>
-            </w:r>
             <w:r>
               <w:rPr>
                 <w:sz w:val="24"/>
@@ -16395,10 +16273,10 @@
         <w:tblLook w:val="04A0" w:firstRow="1" w:lastRow="0" w:firstColumn="1" w:lastColumn="0" w:noHBand="0" w:noVBand="1"/>
       </w:tblPr>
       <w:tblGrid>
-        <w:gridCol w:w="2842"/>
+        <w:gridCol w:w="2322"/>
         <w:gridCol w:w="1910"/>
-        <w:gridCol w:w="2581"/>
-        <w:gridCol w:w="2011"/>
+        <w:gridCol w:w="2993"/>
+        <w:gridCol w:w="2119"/>
       </w:tblGrid>
       <w:tr>
         <w:trPr>
@@ -16657,21 +16535,6 @@
                 <w:sz w:val="24"/>
                 <w:szCs w:val="22"/>
               </w:rPr>
-              <w:t>purchase_manager</w:t>
-            </w:r>
-            <w:r>
-              <w:rPr>
-                <w:sz w:val="24"/>
-                <w:szCs w:val="22"/>
-                <w:lang w:val="en-US"/>
-              </w:rPr>
-              <w:t>_</w:t>
-            </w:r>
-            <w:r>
-              <w:rPr>
-                <w:sz w:val="24"/>
-                <w:szCs w:val="22"/>
-              </w:rPr>
               <w:t>user_id</w:t>
             </w:r>
           </w:p>
@@ -16865,11 +16728,25 @@
     <w:p>
       <w:pPr>
         <w:pStyle w:val="a2"/>
+        <w:rPr>
+          <w:lang w:val="en-US"/>
+        </w:rPr>
       </w:pPr>
     </w:p>
     <w:p>
       <w:pPr>
         <w:pStyle w:val="a2"/>
+        <w:rPr>
+          <w:lang w:val="en-US"/>
+        </w:rPr>
+      </w:pPr>
+    </w:p>
+    <w:p>
+      <w:pPr>
+        <w:pStyle w:val="a2"/>
+        <w:rPr>
+          <w:lang w:val="en-US"/>
+        </w:rPr>
       </w:pPr>
     </w:p>
     <w:p>
@@ -17189,29 +17066,6 @@
               <w:rPr>
                 <w:sz w:val="24"/>
                 <w:szCs w:val="22"/>
-                <w:lang w:val="en-US"/>
-              </w:rPr>
-              <w:t>m</w:t>
-            </w:r>
-            <w:r>
-              <w:rPr>
-                <w:sz w:val="24"/>
-                <w:szCs w:val="22"/>
-              </w:rPr>
-              <w:t>anager</w:t>
-            </w:r>
-            <w:r>
-              <w:rPr>
-                <w:sz w:val="24"/>
-                <w:szCs w:val="22"/>
-                <w:lang w:val="en-US"/>
-              </w:rPr>
-              <w:t>_</w:t>
-            </w:r>
-            <w:r>
-              <w:rPr>
-                <w:sz w:val="24"/>
-                <w:szCs w:val="22"/>
               </w:rPr>
               <w:t>user_id</w:t>
             </w:r>
@@ -17579,10 +17433,10 @@
         <w:tblLook w:val="04A0" w:firstRow="1" w:lastRow="0" w:firstColumn="1" w:lastColumn="0" w:noHBand="0" w:noVBand="1"/>
       </w:tblPr>
       <w:tblGrid>
-        <w:gridCol w:w="2082"/>
+        <w:gridCol w:w="1563"/>
         <w:gridCol w:w="1910"/>
-        <w:gridCol w:w="3183"/>
-        <w:gridCol w:w="2169"/>
+        <w:gridCol w:w="3595"/>
+        <w:gridCol w:w="2276"/>
       </w:tblGrid>
       <w:tr>
         <w:trPr>
@@ -17836,21 +17690,6 @@
                 <w:szCs w:val="22"/>
               </w:rPr>
             </w:pPr>
-            <w:r>
-              <w:rPr>
-                <w:sz w:val="24"/>
-                <w:szCs w:val="22"/>
-              </w:rPr>
-              <w:t>accountant</w:t>
-            </w:r>
-            <w:r>
-              <w:rPr>
-                <w:sz w:val="24"/>
-                <w:szCs w:val="22"/>
-                <w:lang w:val="en-US"/>
-              </w:rPr>
-              <w:t>_</w:t>
-            </w:r>
             <w:r>
               <w:rPr>
                 <w:sz w:val="24"/>
@@ -18360,21 +18199,6 @@
                 <w:sz w:val="24"/>
                 <w:szCs w:val="22"/>
               </w:rPr>
-              <w:t>administrator</w:t>
-            </w:r>
-            <w:r>
-              <w:rPr>
-                <w:sz w:val="24"/>
-                <w:szCs w:val="22"/>
-                <w:lang w:val="en-US"/>
-              </w:rPr>
-              <w:t>_</w:t>
-            </w:r>
-            <w:r>
-              <w:rPr>
-                <w:sz w:val="24"/>
-                <w:szCs w:val="22"/>
-              </w:rPr>
               <w:t>user_id</w:t>
             </w:r>
           </w:p>
@@ -18596,7 +18420,7 @@
       <w:pPr>
         <w:pStyle w:val="3"/>
       </w:pPr>
-      <w:bookmarkStart w:id="21" w:name="_Toc228459495"/>
+      <w:bookmarkStart w:id="21" w:name="_Toc229325580"/>
       <w:r>
         <w:t>Таблицы группы «Справочники»</w:t>
       </w:r>
@@ -21978,21 +21802,6 @@
                 <w:sz w:val="24"/>
                 <w:szCs w:val="22"/>
               </w:rPr>
-              <w:t>group</w:t>
-            </w:r>
-            <w:r>
-              <w:rPr>
-                <w:sz w:val="24"/>
-                <w:szCs w:val="22"/>
-                <w:lang w:val="en-US"/>
-              </w:rPr>
-              <w:t>_</w:t>
-            </w:r>
-            <w:r>
-              <w:rPr>
-                <w:sz w:val="24"/>
-                <w:szCs w:val="22"/>
-              </w:rPr>
               <w:t>coach_id</w:t>
             </w:r>
           </w:p>
@@ -22211,7 +22020,7 @@
       <w:pPr>
         <w:pStyle w:val="3"/>
       </w:pPr>
-      <w:bookmarkStart w:id="22" w:name="_Toc228459496"/>
+      <w:bookmarkStart w:id="22" w:name="_Toc229325581"/>
       <w:r>
         <w:t>Таблицы группы «Закупки и планирование»</w:t>
       </w:r>
@@ -23656,10 +23465,10 @@
         <w:tblLook w:val="04A0" w:firstRow="1" w:lastRow="0" w:firstColumn="1" w:lastColumn="0" w:noHBand="0" w:noVBand="1"/>
       </w:tblPr>
       <w:tblGrid>
-        <w:gridCol w:w="3260"/>
-        <w:gridCol w:w="1508"/>
-        <w:gridCol w:w="3147"/>
-        <w:gridCol w:w="1429"/>
+        <w:gridCol w:w="2450"/>
+        <w:gridCol w:w="1700"/>
+        <w:gridCol w:w="3584"/>
+        <w:gridCol w:w="1610"/>
       </w:tblGrid>
       <w:tr>
         <w:trPr>
@@ -23928,15 +23737,7 @@
                 <w:szCs w:val="22"/>
                 <w:lang w:val="en-US"/>
               </w:rPr>
-              <w:t>purchase_request_item</w:t>
-            </w:r>
-            <w:r>
-              <w:rPr>
-                <w:sz w:val="24"/>
-                <w:szCs w:val="22"/>
-                <w:lang w:val="en-US"/>
-              </w:rPr>
-              <w:t>_</w:t>
+              <w:t>purchase_</w:t>
             </w:r>
             <w:r>
               <w:rPr>
@@ -24069,22 +23870,6 @@
                 <w:lang w:val="en-US"/>
               </w:rPr>
             </w:pPr>
-            <w:r>
-              <w:rPr>
-                <w:sz w:val="24"/>
-                <w:szCs w:val="22"/>
-                <w:lang w:val="en-US"/>
-              </w:rPr>
-              <w:t>purchase_request_item</w:t>
-            </w:r>
-            <w:r>
-              <w:rPr>
-                <w:sz w:val="24"/>
-                <w:szCs w:val="22"/>
-                <w:lang w:val="en-US"/>
-              </w:rPr>
-              <w:t>_</w:t>
-            </w:r>
             <w:r>
               <w:rPr>
                 <w:sz w:val="24"/>
@@ -25170,21 +24955,6 @@
                 <w:sz w:val="24"/>
                 <w:szCs w:val="22"/>
               </w:rPr>
-              <w:t>purchase_order</w:t>
-            </w:r>
-            <w:r>
-              <w:rPr>
-                <w:sz w:val="24"/>
-                <w:szCs w:val="22"/>
-                <w:lang w:val="en-US"/>
-              </w:rPr>
-              <w:t>_</w:t>
-            </w:r>
-            <w:r>
-              <w:rPr>
-                <w:sz w:val="24"/>
-                <w:szCs w:val="22"/>
-              </w:rPr>
               <w:t>supplier_id</w:t>
             </w:r>
           </w:p>
@@ -25303,8 +25073,16 @@
               <w:rPr>
                 <w:sz w:val="24"/>
                 <w:szCs w:val="22"/>
-              </w:rPr>
-              <w:t>purchase_order</w:t>
+                <w:lang w:val="en-US"/>
+              </w:rPr>
+              <w:t>p</w:t>
+            </w:r>
+            <w:r>
+              <w:rPr>
+                <w:sz w:val="24"/>
+                <w:szCs w:val="22"/>
+              </w:rPr>
+              <w:t>urchase</w:t>
             </w:r>
             <w:r>
               <w:rPr>
@@ -25446,7 +25224,6 @@
                 <w:sz w:val="24"/>
                 <w:szCs w:val="22"/>
               </w:rPr>
-              <w:lastRenderedPageBreak/>
               <w:t>total_amount</w:t>
             </w:r>
           </w:p>
@@ -25541,6 +25318,7 @@
                 <w:sz w:val="24"/>
                 <w:szCs w:val="22"/>
               </w:rPr>
+              <w:lastRenderedPageBreak/>
               <w:t>expected_delivery_date</w:t>
             </w:r>
           </w:p>
@@ -25737,7 +25515,7 @@
       <w:pPr>
         <w:pStyle w:val="3"/>
       </w:pPr>
-      <w:bookmarkStart w:id="23" w:name="_Toc228459497"/>
+      <w:bookmarkStart w:id="23" w:name="_Toc229325582"/>
       <w:r>
         <w:t>Таблицы группы «Складской учет»</w:t>
       </w:r>
@@ -25790,10 +25568,10 @@
         <w:tblLook w:val="04A0" w:firstRow="1" w:lastRow="0" w:firstColumn="1" w:lastColumn="0" w:noHBand="0" w:noVBand="1"/>
       </w:tblPr>
       <w:tblGrid>
-        <w:gridCol w:w="3024"/>
-        <w:gridCol w:w="1703"/>
-        <w:gridCol w:w="2919"/>
-        <w:gridCol w:w="1698"/>
+        <w:gridCol w:w="2240"/>
+        <w:gridCol w:w="1909"/>
+        <w:gridCol w:w="3292"/>
+        <w:gridCol w:w="1903"/>
       </w:tblGrid>
       <w:tr>
         <w:trPr>
@@ -26153,21 +25931,6 @@
                 <w:sz w:val="24"/>
                 <w:szCs w:val="22"/>
               </w:rPr>
-              <w:t>inventory_item</w:t>
-            </w:r>
-            <w:r>
-              <w:rPr>
-                <w:sz w:val="24"/>
-                <w:szCs w:val="22"/>
-                <w:lang w:val="en-US"/>
-              </w:rPr>
-              <w:t>_</w:t>
-            </w:r>
-            <w:r>
-              <w:rPr>
-                <w:sz w:val="24"/>
-                <w:szCs w:val="22"/>
-              </w:rPr>
               <w:t>nomenclature_id</w:t>
             </w:r>
           </w:p>
@@ -26498,21 +26261,6 @@
                 <w:sz w:val="24"/>
                 <w:szCs w:val="22"/>
               </w:rPr>
-              <w:t>inventory_item</w:t>
-            </w:r>
-            <w:r>
-              <w:rPr>
-                <w:sz w:val="24"/>
-                <w:szCs w:val="22"/>
-                <w:lang w:val="en-US"/>
-              </w:rPr>
-              <w:t>_</w:t>
-            </w:r>
-            <w:r>
-              <w:rPr>
-                <w:sz w:val="24"/>
-                <w:szCs w:val="22"/>
-              </w:rPr>
               <w:t>warehouse_id</w:t>
             </w:r>
           </w:p>
@@ -27019,8 +26767,16 @@
               <w:rPr>
                 <w:sz w:val="24"/>
                 <w:szCs w:val="22"/>
-              </w:rPr>
-              <w:t>current_holder_id</w:t>
+                <w:lang w:val="en-US"/>
+              </w:rPr>
+              <w:t>athlete</w:t>
+            </w:r>
+            <w:r>
+              <w:rPr>
+                <w:sz w:val="24"/>
+                <w:szCs w:val="22"/>
+              </w:rPr>
+              <w:t>_id</w:t>
             </w:r>
           </w:p>
         </w:tc>
@@ -27376,10 +27132,10 @@
         <w:tblLook w:val="04A0" w:firstRow="1" w:lastRow="0" w:firstColumn="1" w:lastColumn="0" w:noHBand="0" w:noVBand="1"/>
       </w:tblPr>
       <w:tblGrid>
-        <w:gridCol w:w="2854"/>
-        <w:gridCol w:w="1682"/>
-        <w:gridCol w:w="3216"/>
-        <w:gridCol w:w="1592"/>
+        <w:gridCol w:w="2586"/>
+        <w:gridCol w:w="1749"/>
+        <w:gridCol w:w="3354"/>
+        <w:gridCol w:w="1655"/>
       </w:tblGrid>
       <w:tr>
         <w:trPr>
@@ -27638,7 +27394,6 @@
                 <w:sz w:val="24"/>
                 <w:szCs w:val="22"/>
               </w:rPr>
-              <w:lastRenderedPageBreak/>
               <w:t>receipt_invoice</w:t>
             </w:r>
             <w:r>
@@ -27870,23 +27625,25 @@
               <w:rPr>
                 <w:sz w:val="24"/>
                 <w:szCs w:val="22"/>
-              </w:rPr>
-              <w:t>receipt_invoice</w:t>
-            </w:r>
-            <w:r>
-              <w:rPr>
-                <w:sz w:val="24"/>
-                <w:szCs w:val="22"/>
                 <w:lang w:val="en-US"/>
               </w:rPr>
+              <w:t>purchase_order</w:t>
+            </w:r>
+            <w:r>
+              <w:rPr>
+                <w:sz w:val="24"/>
+                <w:szCs w:val="22"/>
+                <w:lang w:val="en-US"/>
+              </w:rPr>
               <w:t>_</w:t>
             </w:r>
             <w:r>
               <w:rPr>
                 <w:sz w:val="24"/>
                 <w:szCs w:val="22"/>
-              </w:rPr>
-              <w:t>order_id</w:t>
+                <w:lang w:val="en-US"/>
+              </w:rPr>
+              <w:t>id</w:t>
             </w:r>
           </w:p>
         </w:tc>
@@ -28013,21 +27770,7 @@
                 <w:sz w:val="24"/>
                 <w:szCs w:val="22"/>
               </w:rPr>
-              <w:t>receipt_invoice</w:t>
-            </w:r>
-            <w:r>
-              <w:rPr>
-                <w:sz w:val="24"/>
-                <w:szCs w:val="22"/>
-                <w:lang w:val="en-US"/>
-              </w:rPr>
-              <w:t>_</w:t>
-            </w:r>
-            <w:r>
-              <w:rPr>
-                <w:sz w:val="24"/>
-                <w:szCs w:val="22"/>
-              </w:rPr>
+              <w:lastRenderedPageBreak/>
               <w:t>storekeeper_id</w:t>
             </w:r>
           </w:p>
@@ -28510,10 +28253,10 @@
         <w:tblLook w:val="04A0" w:firstRow="1" w:lastRow="0" w:firstColumn="1" w:lastColumn="0" w:noHBand="0" w:noVBand="1"/>
       </w:tblPr>
       <w:tblGrid>
-        <w:gridCol w:w="3317"/>
-        <w:gridCol w:w="1510"/>
-        <w:gridCol w:w="3010"/>
-        <w:gridCol w:w="1507"/>
+        <w:gridCol w:w="2873"/>
+        <w:gridCol w:w="1616"/>
+        <w:gridCol w:w="3241"/>
+        <w:gridCol w:w="1614"/>
       </w:tblGrid>
       <w:tr>
         <w:trPr>
@@ -28774,22 +28517,6 @@
                 <w:szCs w:val="22"/>
                 <w:lang w:val="en-US"/>
               </w:rPr>
-              <w:t>issuance_document</w:t>
-            </w:r>
-            <w:r>
-              <w:rPr>
-                <w:sz w:val="24"/>
-                <w:szCs w:val="22"/>
-                <w:lang w:val="en-US"/>
-              </w:rPr>
-              <w:t>_</w:t>
-            </w:r>
-            <w:r>
-              <w:rPr>
-                <w:sz w:val="24"/>
-                <w:szCs w:val="22"/>
-                <w:lang w:val="en-US"/>
-              </w:rPr>
               <w:t>inventory_item_id</w:t>
             </w:r>
           </w:p>
@@ -28917,21 +28644,6 @@
                 <w:sz w:val="24"/>
                 <w:szCs w:val="22"/>
               </w:rPr>
-              <w:t>issuance_document</w:t>
-            </w:r>
-            <w:r>
-              <w:rPr>
-                <w:sz w:val="24"/>
-                <w:szCs w:val="22"/>
-                <w:lang w:val="en-US"/>
-              </w:rPr>
-              <w:t>_</w:t>
-            </w:r>
-            <w:r>
-              <w:rPr>
-                <w:sz w:val="24"/>
-                <w:szCs w:val="22"/>
-              </w:rPr>
               <w:t>athlete_id</w:t>
             </w:r>
           </w:p>
@@ -29051,21 +28763,6 @@
                 <w:sz w:val="24"/>
                 <w:szCs w:val="22"/>
               </w:rPr>
-              <w:t>issuance_document</w:t>
-            </w:r>
-            <w:r>
-              <w:rPr>
-                <w:sz w:val="24"/>
-                <w:szCs w:val="22"/>
-                <w:lang w:val="en-US"/>
-              </w:rPr>
-              <w:t>_</w:t>
-            </w:r>
-            <w:r>
-              <w:rPr>
-                <w:sz w:val="24"/>
-                <w:szCs w:val="22"/>
-              </w:rPr>
               <w:t>storekeeper_id</w:t>
             </w:r>
           </w:p>
@@ -29887,7 +29584,6 @@
                 <w:sz w:val="24"/>
                 <w:szCs w:val="22"/>
               </w:rPr>
-              <w:lastRenderedPageBreak/>
               <w:t>issuance_document</w:t>
             </w:r>
             <w:r>
@@ -29990,7 +29686,7 @@
       <w:pPr>
         <w:pStyle w:val="3"/>
       </w:pPr>
-      <w:bookmarkStart w:id="24" w:name="_Toc228459498"/>
+      <w:bookmarkStart w:id="24" w:name="_Toc229325583"/>
       <w:r>
         <w:t>Таблицы группы «Вспомогательные»</w:t>
       </w:r>
@@ -30305,21 +30001,6 @@
                 <w:sz w:val="24"/>
                 <w:szCs w:val="22"/>
               </w:rPr>
-              <w:t>operation_log</w:t>
-            </w:r>
-            <w:r>
-              <w:rPr>
-                <w:sz w:val="24"/>
-                <w:szCs w:val="22"/>
-                <w:lang w:val="en-US"/>
-              </w:rPr>
-              <w:t>_</w:t>
-            </w:r>
-            <w:r>
-              <w:rPr>
-                <w:sz w:val="24"/>
-                <w:szCs w:val="22"/>
-              </w:rPr>
               <w:t>user_id</w:t>
             </w:r>
           </w:p>
@@ -30725,6 +30406,7 @@
                 <w:sz w:val="24"/>
                 <w:szCs w:val="22"/>
               </w:rPr>
+              <w:lastRenderedPageBreak/>
               <w:t>details</w:t>
             </w:r>
           </w:p>
@@ -31015,7 +30697,7 @@
       <w:pPr>
         <w:pStyle w:val="20"/>
       </w:pPr>
-      <w:bookmarkStart w:id="25" w:name="_Toc228459499"/>
+      <w:bookmarkStart w:id="25" w:name="_Toc229325584"/>
       <w:r>
         <w:t>Связи между таблицами</w:t>
       </w:r>
@@ -31308,7 +30990,7 @@
               <w:rPr>
                 <w:sz w:val="24"/>
               </w:rPr>
-              <w:t>athlete_user_id</w:t>
+              <w:t>user_id</w:t>
             </w:r>
           </w:p>
         </w:tc>
@@ -31423,7 +31105,7 @@
               <w:rPr>
                 <w:sz w:val="24"/>
               </w:rPr>
-              <w:t>coach_user_id</w:t>
+              <w:t>user_id</w:t>
             </w:r>
           </w:p>
         </w:tc>
@@ -31538,7 +31220,7 @@
               <w:rPr>
                 <w:sz w:val="24"/>
               </w:rPr>
-              <w:t>storekeeper_user_id</w:t>
+              <w:t>user_id</w:t>
             </w:r>
           </w:p>
         </w:tc>
@@ -31653,7 +31335,7 @@
               <w:rPr>
                 <w:sz w:val="24"/>
               </w:rPr>
-              <w:t>purchase_manager_user_id</w:t>
+              <w:t>user_id</w:t>
             </w:r>
           </w:p>
         </w:tc>
@@ -31768,7 +31450,7 @@
               <w:rPr>
                 <w:sz w:val="24"/>
               </w:rPr>
-              <w:t>manager_user_id</w:t>
+              <w:t>user_id</w:t>
             </w:r>
           </w:p>
         </w:tc>
@@ -31883,7 +31565,7 @@
               <w:rPr>
                 <w:sz w:val="24"/>
               </w:rPr>
-              <w:t>accountant_user_id</w:t>
+              <w:t>user_id</w:t>
             </w:r>
           </w:p>
         </w:tc>
@@ -31998,7 +31680,7 @@
               <w:rPr>
                 <w:sz w:val="24"/>
               </w:rPr>
-              <w:t>administrator_user_id</w:t>
+              <w:t>user_id</w:t>
             </w:r>
           </w:p>
         </w:tc>
@@ -32113,7 +31795,7 @@
               <w:rPr>
                 <w:sz w:val="24"/>
               </w:rPr>
-              <w:t>athlete_coach_id</w:t>
+              <w:t>coach_id</w:t>
             </w:r>
           </w:p>
         </w:tc>
@@ -32228,7 +31910,7 @@
               <w:rPr>
                 <w:sz w:val="24"/>
               </w:rPr>
-              <w:t>group_coach_id</w:t>
+              <w:t>coach_id</w:t>
             </w:r>
           </w:p>
         </w:tc>
@@ -32343,7 +32025,7 @@
               <w:rPr>
                 <w:sz w:val="24"/>
               </w:rPr>
-              <w:t>athlete_group_id</w:t>
+              <w:t>group_id</w:t>
             </w:r>
           </w:p>
         </w:tc>
@@ -32458,7 +32140,7 @@
               <w:rPr>
                 <w:sz w:val="24"/>
               </w:rPr>
-              <w:t>storekeeper_warehouse_id</w:t>
+              <w:t>warehouse_id</w:t>
             </w:r>
           </w:p>
         </w:tc>
@@ -32573,7 +32255,7 @@
               <w:rPr>
                 <w:sz w:val="24"/>
               </w:rPr>
-              <w:t>inventory_item_warehouse_id</w:t>
+              <w:t>warehouse_id</w:t>
             </w:r>
           </w:p>
         </w:tc>
@@ -32688,7 +32370,7 @@
               <w:rPr>
                 <w:sz w:val="24"/>
               </w:rPr>
-              <w:t>inventory_item_nomenclature_id</w:t>
+              <w:t>nomenclature_id</w:t>
             </w:r>
           </w:p>
         </w:tc>
@@ -32805,7 +32487,7 @@
                 <w:sz w:val="24"/>
                 <w:lang w:val="en-US"/>
               </w:rPr>
-              <w:t>purchase_request_item_nomenclature_id</w:t>
+              <w:t>nomenclature_id</w:t>
             </w:r>
           </w:p>
         </w:tc>
@@ -32920,7 +32602,7 @@
               <w:rPr>
                 <w:sz w:val="24"/>
               </w:rPr>
-              <w:t>purchase_order_supplier_id</w:t>
+              <w:t>supplier_id</w:t>
             </w:r>
           </w:p>
         </w:tc>
@@ -33035,7 +32717,7 @@
               <w:rPr>
                 <w:sz w:val="24"/>
               </w:rPr>
-              <w:t>purchase_order_manager_id</w:t>
+              <w:t>purchase_manager_id</w:t>
             </w:r>
           </w:p>
         </w:tc>
@@ -33149,8 +32831,15 @@
             <w:r>
               <w:rPr>
                 <w:sz w:val="24"/>
-              </w:rPr>
-              <w:t>receipt_invoice_order_id</w:t>
+                <w:lang w:val="en-US"/>
+              </w:rPr>
+              <w:t>purchase</w:t>
+            </w:r>
+            <w:r>
+              <w:rPr>
+                <w:sz w:val="24"/>
+              </w:rPr>
+              <w:t>_order_id</w:t>
             </w:r>
           </w:p>
         </w:tc>
@@ -33265,7 +32954,7 @@
               <w:rPr>
                 <w:sz w:val="24"/>
               </w:rPr>
-              <w:t>receipt_invoice_storekeeper_id</w:t>
+              <w:t>storekeeper_id</w:t>
             </w:r>
           </w:p>
         </w:tc>
@@ -33314,7 +33003,6 @@
               <w:rPr>
                 <w:sz w:val="24"/>
               </w:rPr>
-              <w:lastRenderedPageBreak/>
               <w:t>storekeeper</w:t>
             </w:r>
           </w:p>
@@ -33381,7 +33069,7 @@
               <w:rPr>
                 <w:sz w:val="24"/>
               </w:rPr>
-              <w:t>issuance_document_storekeeper_id</w:t>
+              <w:t>storekeeper_id</w:t>
             </w:r>
           </w:p>
         </w:tc>
@@ -33495,8 +33183,15 @@
             <w:r>
               <w:rPr>
                 <w:sz w:val="24"/>
-              </w:rPr>
-              <w:t>current_holder_id</w:t>
+                <w:lang w:val="en-US"/>
+              </w:rPr>
+              <w:t>athlete_</w:t>
+            </w:r>
+            <w:r>
+              <w:rPr>
+                <w:sz w:val="24"/>
+              </w:rPr>
+              <w:t>id</w:t>
             </w:r>
           </w:p>
         </w:tc>
@@ -33611,7 +33306,7 @@
               <w:rPr>
                 <w:sz w:val="24"/>
               </w:rPr>
-              <w:t>issuance_document_athlete_id</w:t>
+              <w:t>athlete_id</w:t>
             </w:r>
           </w:p>
         </w:tc>
@@ -33728,7 +33423,7 @@
                 <w:sz w:val="24"/>
                 <w:lang w:val="en-US"/>
               </w:rPr>
-              <w:t>issuance_document_inventory_item_id</w:t>
+              <w:t>inventory_item_id</w:t>
             </w:r>
           </w:p>
         </w:tc>
@@ -34075,7 +33770,7 @@
                 <w:sz w:val="24"/>
                 <w:lang w:val="en-US"/>
               </w:rPr>
-              <w:t>purchase_request_item_request_id</w:t>
+              <w:t>purchase_request_id</w:t>
             </w:r>
           </w:p>
         </w:tc>
@@ -34190,7 +33885,7 @@
               <w:rPr>
                 <w:sz w:val="24"/>
               </w:rPr>
-              <w:t>operation_log_user_id</w:t>
+              <w:t>user_id</w:t>
             </w:r>
           </w:p>
         </w:tc>
@@ -34221,14 +33916,26 @@
     <w:p>
       <w:pPr>
         <w:pStyle w:val="a2"/>
+        <w:rPr>
+          <w:lang w:val="en-US"/>
+        </w:rPr>
+      </w:pPr>
+    </w:p>
+    <w:p>
+      <w:pPr>
+        <w:pStyle w:val="a2"/>
+        <w:rPr>
+          <w:lang w:val="en-US"/>
+        </w:rPr>
       </w:pPr>
     </w:p>
     <w:p>
       <w:pPr>
         <w:pStyle w:val="20"/>
       </w:pPr>
-      <w:bookmarkStart w:id="26" w:name="_Toc228459500"/>
+      <w:bookmarkStart w:id="26" w:name="_Toc229325585"/>
       <w:r>
+        <w:lastRenderedPageBreak/>
         <w:t>С</w:t>
       </w:r>
       <w:r>
@@ -34283,10 +33990,10 @@
         <w:tblLook w:val="04A0" w:firstRow="1" w:lastRow="0" w:firstColumn="1" w:lastColumn="0" w:noHBand="0" w:noVBand="1"/>
       </w:tblPr>
       <w:tblGrid>
-        <w:gridCol w:w="1966"/>
-        <w:gridCol w:w="2321"/>
-        <w:gridCol w:w="3179"/>
-        <w:gridCol w:w="1878"/>
+        <w:gridCol w:w="2126"/>
+        <w:gridCol w:w="2514"/>
+        <w:gridCol w:w="2674"/>
+        <w:gridCol w:w="2030"/>
       </w:tblGrid>
       <w:tr>
         <w:trPr>
@@ -35361,7 +35068,7 @@
               <w:rPr>
                 <w:sz w:val="24"/>
               </w:rPr>
-              <w:t>athlete_group_id</w:t>
+              <w:t>group_id</w:t>
             </w:r>
           </w:p>
         </w:tc>
@@ -35447,7 +35154,7 @@
               <w:rPr>
                 <w:sz w:val="24"/>
               </w:rPr>
-              <w:t>athlete_coach_id</w:t>
+              <w:t>coach_id</w:t>
             </w:r>
           </w:p>
         </w:tc>
@@ -35816,7 +35523,7 @@
               <w:rPr>
                 <w:sz w:val="24"/>
               </w:rPr>
-              <w:t>storekeeper_warehouse_id</w:t>
+              <w:t>warehouse_id</w:t>
             </w:r>
           </w:p>
         </w:tc>
@@ -37109,7 +36816,7 @@
                 <w:sz w:val="24"/>
                 <w:lang w:val="en-US"/>
               </w:rPr>
-              <w:t>purchase_request_item_request_id</w:t>
+              <w:t>purchase_request_id</w:t>
             </w:r>
           </w:p>
         </w:tc>
@@ -37204,7 +36911,7 @@
                 <w:sz w:val="24"/>
                 <w:lang w:val="en-US"/>
               </w:rPr>
-              <w:t>purchase_request_item_nomenclature_id</w:t>
+              <w:t>nomenclature_id</w:t>
             </w:r>
           </w:p>
         </w:tc>
@@ -37824,7 +37531,7 @@
               <w:rPr>
                 <w:sz w:val="24"/>
               </w:rPr>
-              <w:t>purchase_order_supplier_id</w:t>
+              <w:t>supplier_id</w:t>
             </w:r>
           </w:p>
         </w:tc>
@@ -37909,8 +37616,15 @@
             <w:r>
               <w:rPr>
                 <w:sz w:val="24"/>
-              </w:rPr>
-              <w:t>purchase_order_manager_id</w:t>
+                <w:lang w:val="en-US"/>
+              </w:rPr>
+              <w:t>purchase_</w:t>
+            </w:r>
+            <w:r>
+              <w:rPr>
+                <w:sz w:val="24"/>
+              </w:rPr>
+              <w:t>manager_id</w:t>
             </w:r>
           </w:p>
         </w:tc>
@@ -39587,7 +39301,7 @@
               <w:rPr>
                 <w:sz w:val="24"/>
               </w:rPr>
-              <w:t>inventory_item_nomenclature_id</w:t>
+              <w:t>nomenclature_id</w:t>
             </w:r>
           </w:p>
         </w:tc>
@@ -39842,7 +39556,7 @@
               <w:rPr>
                 <w:sz w:val="24"/>
               </w:rPr>
-              <w:t>inventory_item_warehouse_id</w:t>
+              <w:t>warehouse_id</w:t>
             </w:r>
           </w:p>
         </w:tc>
@@ -40316,7 +40030,6 @@
                 <w:sz w:val="24"/>
                 <w:szCs w:val="22"/>
               </w:rPr>
-              <w:lastRenderedPageBreak/>
               <w:t>ВыдачаИнвентаря</w:t>
             </w:r>
           </w:p>
@@ -40365,7 +40078,7 @@
                 <w:sz w:val="24"/>
                 <w:lang w:val="en-US"/>
               </w:rPr>
-              <w:t>issuance_document_inventory_item_id</w:t>
+              <w:t>inventory_item_id</w:t>
             </w:r>
           </w:p>
         </w:tc>
@@ -40459,7 +40172,7 @@
               <w:rPr>
                 <w:sz w:val="24"/>
               </w:rPr>
-              <w:t>issuance_document_athlete_id</w:t>
+              <w:t>athlete_id</w:t>
             </w:r>
           </w:p>
         </w:tc>
@@ -40544,7 +40257,7 @@
               <w:rPr>
                 <w:sz w:val="24"/>
               </w:rPr>
-              <w:t>issuance_document_storekeeper_id</w:t>
+              <w:t>storekeeper_id</w:t>
             </w:r>
           </w:p>
         </w:tc>
@@ -41327,7 +41040,7 @@
               <w:rPr>
                 <w:sz w:val="24"/>
               </w:rPr>
-              <w:t>receipt_invoice_order_id</w:t>
+              <w:t>order_id</w:t>
             </w:r>
           </w:p>
         </w:tc>
@@ -41412,7 +41125,7 @@
               <w:rPr>
                 <w:sz w:val="24"/>
               </w:rPr>
-              <w:t>receipt_invoice_storekeeper_id</w:t>
+              <w:t>storekeeper_id</w:t>
             </w:r>
           </w:p>
         </w:tc>
@@ -41607,11 +41320,6 @@
         </w:tc>
       </w:tr>
     </w:tbl>
-    <w:p>
-      <w:pPr>
-        <w:pStyle w:val="a2"/>
-      </w:pPr>
-    </w:p>
     <w:p>
       <w:pPr>
         <w:pStyle w:val="a2"/>
@@ -41633,7 +41341,7 @@
       <w:pPr>
         <w:pStyle w:val="20"/>
       </w:pPr>
-      <w:bookmarkStart w:id="27" w:name="_Toc228459501"/>
+      <w:bookmarkStart w:id="27" w:name="_Toc229325586"/>
       <w:r>
         <w:lastRenderedPageBreak/>
         <w:t>ER-диаграмма</w:t>
@@ -41646,8 +41354,8 @@
       </w:pPr>
       <w:r>
         <w:drawing>
-          <wp:inline distT="0" distB="0" distL="0" distR="0" wp14:anchorId="19346C47" wp14:editId="2C46CDDD">
-            <wp:extent cx="9245600" cy="4639945"/>
+          <wp:inline distT="0" distB="0" distL="0" distR="0" wp14:anchorId="19346C47" wp14:editId="2ECA7E0C">
+            <wp:extent cx="9244497" cy="4639945"/>
             <wp:effectExtent l="0" t="0" r="0" b="8255"/>
             <wp:docPr id="909424935" name="Рисунок 2"/>
             <wp:cNvGraphicFramePr>
@@ -41657,7 +41365,7 @@
               <a:graphicData uri="http://schemas.openxmlformats.org/drawingml/2006/picture">
                 <pic:pic xmlns:pic="http://schemas.openxmlformats.org/drawingml/2006/picture">
                   <pic:nvPicPr>
-                    <pic:cNvPr id="0" name="Picture 1"/>
+                    <pic:cNvPr id="909424935" name="Рисунок 2"/>
                     <pic:cNvPicPr>
                       <a:picLocks noChangeAspect="1" noChangeArrowheads="1"/>
                     </pic:cNvPicPr>
@@ -41670,7 +41378,6 @@
                         </a:ext>
                       </a:extLst>
                     </a:blip>
-                    <a:srcRect/>
                     <a:stretch>
                       <a:fillRect/>
                     </a:stretch>
@@ -41678,7 +41385,7 @@
                   <pic:spPr bwMode="auto">
                     <a:xfrm>
                       <a:off x="0" y="0"/>
-                      <a:ext cx="9245600" cy="4639945"/>
+                      <a:ext cx="9244497" cy="4639945"/>
                     </a:xfrm>
                     <a:prstGeom prst="rect">
                       <a:avLst/>

</xml_diff>